<commit_message>
Book v4 final: QA audit, Payhip assets and listing kit
Co-Authored-By: Claude Sonnet 5.5 <noreply@anthropic.com>
Claude-Session: https://claude.ai/code/session_01TDEecx11fZJG7Z9gmzjxyw
</commit_message>
<xml_diff>
--- a/_paper4/dist/The-Discard.docx
+++ b/_paper4/dist/The-Discard.docx
@@ -10,7 +10,7 @@
       <w:r>
         <w:drawing>
           <wp:inline xmlns:a="http://schemas.openxmlformats.org/drawingml/2006/main" xmlns:pic="http://schemas.openxmlformats.org/drawingml/2006/picture">
-            <wp:extent cx="3931920" cy="6291072"/>
+            <wp:extent cx="3931920" cy="5897880"/>
             <wp:docPr id="1" name="Picture 1"/>
             <wp:cNvGraphicFramePr>
               <a:graphicFrameLocks noChangeAspect="1"/>
@@ -19,7 +19,7 @@
               <a:graphicData uri="http://schemas.openxmlformats.org/drawingml/2006/picture">
                 <pic:pic>
                   <pic:nvPicPr>
-                    <pic:cNvPr id="0" name="cover4.jpg"/>
+                    <pic:cNvPr id="0" name="cover_book.jpg"/>
                     <pic:cNvPicPr/>
                   </pic:nvPicPr>
                   <pic:blipFill>
@@ -31,7 +31,7 @@
                   <pic:spPr>
                     <a:xfrm>
                       <a:off x="0" y="0"/>
-                      <a:ext cx="3931920" cy="6291072"/>
+                      <a:ext cx="3931920" cy="5897880"/>
                     </a:xfrm>
                     <a:prstGeom prst="rect"/>
                   </pic:spPr>
@@ -1113,7 +1113,7 @@
                     <pic:cNvPicPr/>
                   </pic:nvPicPr>
                   <pic:blipFill>
-                    <a:blip r:embed="rId10"/>
+                    <a:blip r:embed="rId11"/>
                     <a:stretch>
                       <a:fillRect/>
                     </a:stretch>
@@ -1355,6 +1355,59 @@
         <w:pStyle w:val="Heading3"/>
       </w:pPr>
       <w:r>
+        <w:t>Three words, defined once</w:t>
+      </w:r>
+    </w:p>
+    <w:p>
+      <w:pPr>
+        <w:pStyle w:val="BodyFirst"/>
+      </w:pPr>
+      <w:r>
+        <w:rPr>
+          <w:i/>
+        </w:rPr>
+        <w:t>Recovered</w:t>
+      </w:r>
+      <w:r>
+        <w:rPr/>
+        <w:t xml:space="preserve"> means a kidney was removed from a deceased donor in order to be transplanted. </w:t>
+      </w:r>
+      <w:r>
+        <w:rPr>
+          <w:i/>
+        </w:rPr>
+        <w:t>Nonuse</w:t>
+      </w:r>
+      <w:r>
+        <w:rPr/>
+        <w:t xml:space="preserve">, the registry’s term, means a recovered kidney that was not transplanted into anyone; I use </w:t>
+      </w:r>
+      <w:r>
+        <w:rPr>
+          <w:i/>
+        </w:rPr>
+        <w:t>discard</w:t>
+      </w:r>
+      <w:r>
+        <w:rPr/>
+        <w:t xml:space="preserve"> for the same thing when I want to name the human act behind the statistic. </w:t>
+      </w:r>
+      <w:r>
+        <w:rPr>
+          <w:i/>
+        </w:rPr>
+        <w:t>Declined</w:t>
+      </w:r>
+      <w:r>
+        <w:rPr/>
+        <w:t xml:space="preserve"> means a transplant program turned down an offer of a kidney for one of its candidates. A declined kidney can still be transplanted elsewhere, and most are. A discarded one cannot.</w:t>
+      </w:r>
+    </w:p>
+    <w:p>
+      <w:pPr>
+        <w:pStyle w:val="Heading3"/>
+      </w:pPr>
+      <w:r>
         <w:t>How to read the numbers</w:t>
       </w:r>
     </w:p>
@@ -1596,7 +1649,7 @@
                     <pic:cNvPicPr/>
                   </pic:nvPicPr>
                   <pic:blipFill>
-                    <a:blip r:embed="rId11"/>
+                    <a:blip r:embed="rId12"/>
                     <a:stretch>
                       <a:fillRect/>
                     </a:stretch>
@@ -1711,7 +1764,7 @@
                     <pic:cNvPicPr/>
                   </pic:nvPicPr>
                   <pic:blipFill>
-                    <a:blip r:embed="rId12"/>
+                    <a:blip r:embed="rId13"/>
                     <a:stretch>
                       <a:fillRect/>
                     </a:stretch>
@@ -1805,7 +1858,7 @@
                     <pic:cNvPicPr/>
                   </pic:nvPicPr>
                   <pic:blipFill>
-                    <a:blip r:embed="rId13"/>
+                    <a:blip r:embed="rId14"/>
                     <a:stretch>
                       <a:fillRect/>
                     </a:stretch>
@@ -3167,7 +3220,7 @@
                     <pic:cNvPicPr/>
                   </pic:nvPicPr>
                   <pic:blipFill>
-                    <a:blip r:embed="rId14"/>
+                    <a:blip r:embed="rId15"/>
                     <a:stretch>
                       <a:fillRect/>
                     </a:stretch>
@@ -3709,7 +3762,7 @@
                     <pic:cNvPicPr/>
                   </pic:nvPicPr>
                   <pic:blipFill>
-                    <a:blip r:embed="rId15"/>
+                    <a:blip r:embed="rId16"/>
                     <a:stretch>
                       <a:fillRect/>
                     </a:stretch>
@@ -4123,7 +4176,7 @@
                     <pic:cNvPicPr/>
                   </pic:nvPicPr>
                   <pic:blipFill>
-                    <a:blip r:embed="rId16"/>
+                    <a:blip r:embed="rId17"/>
                     <a:stretch>
                       <a:fillRect/>
                     </a:stretch>
@@ -4227,27 +4280,20 @@
       </w:pPr>
       <w:r>
         <w:rPr/>
-        <w:t>I have been asked, by people whose opinions I respect, not to make this chapter a villain story, and I have tried not to.</w:t>
+        <w:t>The agency has a duty to protect the integrity of the list. Candidates who have waited for years have a right to expect that the order will be honored. Out-of-sequence placement, done in the dark and unevenly, can undermine that trust, and trust is the thing every other part of this system depends on. The federal agency has also, in the last two years, been working to rebuild oversight of a network that had been criticized for decades, including by Congress. Seen from the agency’s desk, the memo was a reasonable attempt to restore discipline to a practice that had grown fast and quietly.</w:t>
       </w:r>
     </w:p>
     <w:p>
       <w:pPr/>
       <w:r>
         <w:rPr/>
-        <w:t>The agency has a duty to protect the integrity of the list. Candidates who have waited for years have a right to expect that the order will be honored. Out-of-sequence placement, done in the dark and unevenly, can undermine that trust, and trust is the thing every other part of this system depends on. The federal agency has also, in the last two years, been working to rebuild oversight of a network that had been criticized for decades, including by Congress. Seen from the agency’s desk, the memo was a reasonable attempt to restore discipline to a practice that had grown fast and quietly.</w:t>
+        <w:t>And I do not know what happened next. In April 2026 the network’s board heard an update from a working group that had drafted a definition of what counts as an offer, criteria for an expedited placement pathway, and a framework for auditing it. The board took no action on the proposals at that meeting, and several projects remained paused pending federal review (Source Notes S34). I have not found a report of how the question was settled by the autumn.</w:t>
       </w:r>
     </w:p>
     <w:p>
       <w:pPr/>
       <w:r>
         <w:rPr/>
-        <w:t>And I do not know what happened next. In April 2026 the network’s board heard an update from a working group that had drafted a definition of what counts as an offer, criteria for an expedited placement pathway, and a framework for auditing it. The board took no action on the proposals at that meeting, and several projects remained paused pending federal review (Source Notes S34). I have not found a report of how the question was settled by the autumn.</w:t>
-      </w:r>
-    </w:p>
-    <w:p>
-      <w:pPr/>
-      <w:r>
-        <w:rPr/>
         <w:t>What I can say is that an expedited pathway with a clear definition and a public audit would solve both problems at once: it would keep the list honest and it would keep hard-to-place kidneys moving. The memo got the first without the second. It was a good instinct delivered through a bad instrument.</w:t>
       </w:r>
     </w:p>
@@ -4265,7 +4311,7 @@
       </w:pPr>
       <w:r>
         <w:rPr/>
-        <w:t xml:space="preserve">It proves something narrower and more useful than that regulators are careless. It proves that the system is </w:t>
+        <w:t xml:space="preserve">It proves something narrower and more useful than that regulators are careless: the system is </w:t>
       </w:r>
       <w:r>
         <w:rPr>
@@ -4275,14 +4321,7 @@
       </w:r>
       <w:r>
         <w:rPr/>
-        <w:t>. Within seven weeks, a national network of fifty-five procurement organizations and nearly two hundred kidney transplant programs altered what it did.</w:t>
-      </w:r>
-    </w:p>
-    <w:p>
-      <w:pPr/>
-      <w:r>
-        <w:rPr/>
-        <w:t>That is good news. A system that can change in seven weeks can change. The question is whether we will ever point that speed in a better direction. Later chapters describe the tools, the reforms and the plan. Here we simply note that the reflexes exist.</w:t>
+        <w:t>. Within seven weeks, a national network of fifty-five procurement organizations and nearly two hundred kidney transplant programs altered what it did. A system that can change in seven weeks can change. The question is whether we will ever point that speed in a better direction.</w:t>
       </w:r>
     </w:p>
     <w:p>
@@ -4897,7 +4936,7 @@
                     <pic:cNvPicPr/>
                   </pic:nvPicPr>
                   <pic:blipFill>
-                    <a:blip r:embed="rId17"/>
+                    <a:blip r:embed="rId18"/>
                     <a:stretch>
                       <a:fillRect/>
                     </a:stretch>
@@ -5022,7 +5061,7 @@
                     <pic:cNvPicPr/>
                   </pic:nvPicPr>
                   <pic:blipFill>
-                    <a:blip r:embed="rId18"/>
+                    <a:blip r:embed="rId19"/>
                     <a:stretch>
                       <a:fillRect/>
                     </a:stretch>
@@ -5737,7 +5776,7 @@
                     <pic:cNvPicPr/>
                   </pic:nvPicPr>
                   <pic:blipFill>
-                    <a:blip r:embed="rId19"/>
+                    <a:blip r:embed="rId20"/>
                     <a:stretch>
                       <a:fillRect/>
                     </a:stretch>
@@ -5762,7 +5801,7 @@
       </w:pPr>
       <w:r>
         <w:rPr/>
-        <w:t>Figure 8.1. Left: kidneys still working at ten years, machine perfusion versus cold storage. Right: the share of United States deceased-donor kidneys that are machine-perfused.</w:t>
+        <w:t>Figure 9.1. Left: kidneys still working at ten years, machine perfusion versus cold storage. Right: the share of United States deceased-donor kidneys that are machine-perfused.</w:t>
       </w:r>
     </w:p>
     <w:p>
@@ -6258,7 +6297,7 @@
       <w:pPr/>
       <w:r>
         <w:rPr/>
-        <w:t>None of that makes the work worthless. It makes it a first signal. It is exactly the kind of finding that deserves to be followed by a larger, better trial, and exactly the kind that often is not.</w:t>
+        <w:t>None of that makes the work worthless. It makes it a first signal, the kind that deserves a larger trial.</w:t>
       </w:r>
     </w:p>
     <w:p>
@@ -6364,13 +6403,6 @@
       <w:r>
         <w:rPr/>
         <w:t>There is also a simple checklist, which an outsider can apply from public documents. Watch the ratio of announcements to publications. Watch how the company speaks about the regulator. Watch whether the first trial is an all-or-nothing wager. Watch whether the company can describe its manufacturing plainly. Watch the cash runway against the date the trial will read out.</w:t>
-      </w:r>
-    </w:p>
-    <w:p>
-      <w:pPr/>
-      <w:r>
-        <w:rPr/>
-        <w:t>Apply it to any claim you read about organ preservation, including mine.</w:t>
       </w:r>
     </w:p>
     <w:p>
@@ -6757,23 +6789,6 @@
       <w:r>
         <w:rPr/>
         <w:t>This is why I ask, in the fourth part of this book, that trials of new technologies report their enrollment by race, geography, income and sex, as they go. A technology that reaches only the well connected will deepen the divide it was meant to heal.</w:t>
-      </w:r>
-    </w:p>
-    <w:p>
-      <w:pPr/>
-      <w:r>
-        <w:rPr/>
-        <w:t xml:space="preserve">It is also why I think the five tests of Chapter 12 should be applied to these technologies in advance. Does the person who must act see the benefit? Does the one who pays gain? Does it move a number someone is judged on? Is it easy at three in the morning? If the answer to the third question is </w:t>
-      </w:r>
-      <w:r>
-        <w:rPr>
-          <w:i/>
-        </w:rPr>
-        <w:t>no</w:t>
-      </w:r>
-      <w:r>
-        <w:rPr/>
-        <w:t>, because a pig kidney that fails will hurt a program’s results and one that works will not help them, then the technology will wait on the shelf, and we will have built a miracle and then hidden it.</w:t>
       </w:r>
     </w:p>
     <w:p>
@@ -8291,35 +8306,59 @@
       </w:pPr>
       <w:r>
         <w:rPr/>
-        <w:t>I owe you the story of the cooler fluid, because a book about slow ideas has to include a fast one that was wrong.</w:t>
+        <w:t>For years, nephrologists had observed that some patients felt better, with fewer drops in blood pressure, when the fluid used in dialysis was a little cooler than body temperature. Small studies supported the idea, some with dozens of patients. The reasoning was sensible: cooler blood constricts vessels and holds pressure. The change was almost free. A unit could implement it in an afternoon, and patients who felt better said so.</w:t>
       </w:r>
     </w:p>
     <w:p>
       <w:pPr/>
       <w:r>
         <w:rPr/>
-        <w:t>For years, nephrologists had observed that some patients felt better, with fewer drops in blood pressure, when the fluid used in dialysis was a little cooler than body temperature. Small studies supported the idea, some with dozens of patients. The reasoning was sensible: cooler blood constricts vessels and holds pressure. The change was almost free. A unit could implement it in an afternoon, and patients who felt better said so.</w:t>
+        <w:t>In 2022 the largest trial ever done in hemodialysis tested it. Called MyTEMP, it was a cluster-randomized trial across dialysis centers in Ontario, using the province’s health records, and it compared a personalized cooler dialysate, 0.5 to 0.9 degrees below each patient’s own temperature, with a standard fluid at 36.5 degrees. The outcome was cardiovascular death or hospital admission for a heart attack, stroke or heart failure. It occurred in 21.4 percent of patients receiving the cooler fluid and 22.4 percent of those receiving the standard, a difference too small to be distinguished from chance. Blood-pressure drops during treatment were the same (Source Notes S4). The authors concluded that there was no justification for adopting cooler fluid for all patients, and noted that some patients found it uncomfortable.</w:t>
       </w:r>
     </w:p>
     <w:p>
       <w:pPr/>
       <w:r>
         <w:rPr/>
-        <w:t>In 2022 the largest trial ever done in hemodialysis tested it. Called MyTEMP, it was a cluster-randomized trial across dialysis centers in Ontario, using the province’s health records, and it compared a personalized cooler dialysate, 0.5 to 0.9 degrees below each patient’s own temperature, with a standard fluid at 36.5 degrees. The outcome was cardiovascular death or hospital admission for a heart attack, stroke or heart failure. It occurred in 21.4 percent of patients receiving the cooler fluid and 22.4 percent of those receiving the standard, a difference too small to be distinguished from chance. Blood-pressure drops during treatment were the same (Source Notes S4). The authors concluded that there was no justification for adopting cooler fluid for all patients, and noted that some patients found it uncomfortable.</w:t>
+        <w:t>John Stuart Mill wrote that “he who knows only his own side of the case, knows little of that.” I have told you much of one side of the case in this book, the side that says the system is too slow. MyTEMP is the other side. A system that adopts every plausible idea at once would be as bad as one that adopts none, and for the same reason: it has no way of finding out.</w:t>
       </w:r>
     </w:p>
     <w:p>
       <w:pPr/>
       <w:r>
         <w:rPr/>
-        <w:t>John Stuart Mill wrote that “he who knows only his own side of the case, knows little of that.” I have told you much of one side of the case in this book, the side that says the system is too slow. MyTEMP is the other side. A system that adopts every plausible idea at once would be as bad as one that adopts none, and for the same reason: it has no way of finding out.</w:t>
+        <w:t>The lesson is not that cooler dialysis is useless. Some patients may benefit, and the trial measured heart events, not how a patient feels. The lesson is that intuition is a poor guide, and that fast adoption without a trial is just a different kind of failure.</w:t>
+      </w:r>
+    </w:p>
+    <w:p>
+      <w:pPr>
+        <w:pStyle w:val="Heading3"/>
+      </w:pPr>
+      <w:r>
+        <w:t>Why evidence alone does not win</w:t>
+      </w:r>
+    </w:p>
+    <w:p>
+      <w:pPr>
+        <w:pStyle w:val="BodyFirst"/>
+      </w:pPr>
+      <w:r>
+        <w:rPr/>
+        <w:t>The physicist Max Planck, in the last pages of his autobiography, offered a bleak account of how scientific ideas succeed. “A new scientific truth does not triumph by convincing its opponents and making them see the light,” he wrote, “but rather because its opponents eventually die, and a new generation grows up that is familiar with it.”</w:t>
       </w:r>
     </w:p>
     <w:p>
       <w:pPr/>
       <w:r>
         <w:rPr/>
-        <w:t>The lesson is not that cooler dialysis is useless. Some patients may benefit, and the trial measured heart events, not how a patient feels. The lesson is that intuition is a poor guide, and that fast adoption without a trial is just a different kind of failure.</w:t>
+        <w:t>It is a funny sentence, and the field of kidney medicine cannot afford it. Planck’s remedy, waiting for a generation to pass, is a remedy for physicists. Patients on the list die on a shorter schedule. In 2024 alone, 3,743 candidates were removed from the kidney waiting list because they died (Source Notes S6).</w:t>
+      </w:r>
+    </w:p>
+    <w:p>
+      <w:pPr/>
+      <w:r>
+        <w:rPr/>
+        <w:t>What the five tests suggest is that adoption is not mostly a matter of persuasion. It is a matter of design. A tool becomes routine when the person who must use it can see the benefit, pays a fair price, is judged by the result, and finds it easy to do at night. None of these requires waiting for anyone to die. All of them require someone to decide that adoption is their job.</w:t>
       </w:r>
     </w:p>
     <w:p>
@@ -8327,7 +8366,7 @@
         <w:pStyle w:val="Heading3"/>
       </w:pPr>
       <w:r>
-        <w:t>Why evidence alone does not win</w:t>
+        <w:t>The owner of the adoption</w:t>
       </w:r>
     </w:p>
     <w:p>
@@ -8336,45 +8375,7 @@
       </w:pPr>
       <w:r>
         <w:rPr/>
-        <w:t>The physicist Max Planck, in the last pages of his autobiography, offered a bleak account of how scientific ideas succeed. “A new scientific truth does not triumph by convincing its opponents and making them see the light,” he wrote, “but rather because its opponents eventually die, and a new generation grows up that is familiar with it.”</w:t>
-      </w:r>
-    </w:p>
-    <w:p>
-      <w:pPr/>
-      <w:r>
-        <w:rPr/>
-        <w:t>It is a funny sentence, and the field of kidney medicine cannot afford it. Planck’s remedy, waiting for a generation to pass, is a remedy for physicists. Patients on the list die on a shorter schedule. In 2024 alone, 3,743 candidates were removed from the kidney waiting list because they died (Source Notes S6). The cost of waiting for the old to retire is counted in people.</w:t>
-      </w:r>
-    </w:p>
-    <w:p>
-      <w:pPr/>
-      <w:r>
-        <w:rPr/>
-        <w:t>What the five tests suggest is that adoption is not mostly a matter of persuasion. It is a matter of design. A tool becomes routine when the person who must use it can see the benefit, pays a fair price, is judged by the result, and finds it easy to do at night. None of these requires waiting for anyone to die. All of them require someone to decide that adoption is their job.</w:t>
-      </w:r>
-    </w:p>
-    <w:p>
-      <w:pPr>
-        <w:pStyle w:val="Heading3"/>
-      </w:pPr>
-      <w:r>
-        <w:t>The owner of the adoption</w:t>
-      </w:r>
-    </w:p>
-    <w:p>
-      <w:pPr>
-        <w:pStyle w:val="BodyFirst"/>
-      </w:pPr>
-      <w:r>
-        <w:rPr/>
         <w:t>And that is the missing piece. In the case of the pump, the oxygen carrier, hemodiafiltration, and the offer ledger of Chapter 2, no institution has the task of moving a proven idea from the journal to the bedside. The journals publish, the regulators approve, the payers reimburse, the societies recommend. None of them owns the gap between what is known and what is done.</w:t>
-      </w:r>
-    </w:p>
-    <w:p>
-      <w:pPr/>
-      <w:r>
-        <w:rPr/>
-        <w:t>Machiavelli, five centuries ago, said what to expect: that the reformer will have many enemies and few defenders. He was describing princes, but the pattern generalizes. The defenders of the new order are lukewarm because they do not yet have what it will give them. The enemies are fierce because they have what the old order gave them now.</w:t>
       </w:r>
     </w:p>
     <w:p>
@@ -8494,7 +8495,7 @@
       </w:pPr>
       <w:r>
         <w:rPr/>
-        <w:t>Most books of this kind end with an appeal to awareness. I have little patience for it, and the reason is that the people who will read this book are, for the most part, already aware. They have sat in a waiting room. They have watched a parent or a friend or themselves wait. What they lack is not information about the problem but a short list of specific, answerable demands, each addressed to a named institution, with a number attached and a date beside it.</w:t>
+        <w:t>Most books of this kind end with an appeal to awareness. I have little patience for it, and the reason is that the people who will read this book are, for the most part, already aware. They have waited, or watched someone wait. What they lack is not information about the problem but a short list of specific, answerable demands, each addressed to a named institution, with a number attached and a date beside it.</w:t>
       </w:r>
     </w:p>
     <w:p>
@@ -8508,14 +8509,7 @@
       <w:pPr/>
       <w:r>
         <w:rPr/>
-        <w:t>I want to say something here about anger, since the part is called what it is. I have felt it throughout this book, and I suspect you have. It is a legitimate response to a kidney that never reached a body and a person who never left the chair. But anger without a plan is a feeling. With a plan, it is fuel.</w:t>
-      </w:r>
-    </w:p>
-    <w:p>
-      <w:pPr/>
-      <w:r>
-        <w:rPr/>
-        <w:t>A last word on tone. The institutions named in the next chapters are not enemies. Most of the people in them are trying, in difficult circumstances, to do the right thing. The plan assumes they will welcome clarity, because clarity makes their jobs easier. Where they do not, the plan has remedies for that too.</w:t>
+        <w:t>A word about anger. It is a legitimate response to a kidney that never reached a body and a person who never left the chair. But anger without a plan is a feeling. With a plan, it is fuel.</w:t>
       </w:r>
     </w:p>
     <w:p>
@@ -8623,7 +8617,7 @@
                     <pic:cNvPicPr/>
                   </pic:nvPicPr>
                   <pic:blipFill>
-                    <a:blip r:embed="rId20"/>
+                    <a:blip r:embed="rId21"/>
                     <a:stretch>
                       <a:fillRect/>
                     </a:stretch>
@@ -8648,7 +8642,7 @@
       </w:pPr>
       <w:r>
         <w:rPr/>
-        <w:t>Figure 11.1. The fifteen moves, grouped by who must act, with the chapter in which each is argued.</w:t>
+        <w:t>Figure 13.1. The fifteen moves, grouped by who must act, with the chapter in which each is argued.</w:t>
       </w:r>
     </w:p>
     <w:tbl>
@@ -20546,13 +20540,47 @@
       </w:r>
     </w:p>
     <w:sectPr>
+      <w:footerReference w:type="default" r:id="rId10"/>
       <w:pgSz w:w="8640" w:h="12960"/>
       <w:pgMar w:top="1296" w:right="1296" w:bottom="1368" w:left="1296" w:header="720" w:footer="720" w:gutter="0"/>
       <w:cols w:space="720"/>
+      <w:titlePg/>
       <w:docGrid w:linePitch="360"/>
     </w:sectPr>
   </w:body>
 </w:document>
+</file>
+
+<file path=word/footer1.xml><?xml version="1.0" encoding="utf-8"?>
+<w:ftr xmlns:m="http://schemas.openxmlformats.org/officeDocument/2006/math" xmlns:mc="http://schemas.openxmlformats.org/markup-compatibility/2006" xmlns:mo="http://schemas.microsoft.com/office/mac/office/2008/main" xmlns:mv="urn:schemas-microsoft-com:mac:vml" xmlns:o="urn:schemas-microsoft-com:office:office" xmlns:r="http://schemas.openxmlformats.org/officeDocument/2006/relationships" xmlns:v="urn:schemas-microsoft-com:vml" xmlns:w10="urn:schemas-microsoft-com:office:word" xmlns:w14="http://schemas.microsoft.com/office/word/2010/wordml" xmlns:w="http://schemas.openxmlformats.org/wordprocessingml/2006/main" xmlns:wne="http://schemas.microsoft.com/office/word/2006/wordml" xmlns:wp14="http://schemas.microsoft.com/office/word/2010/wordprocessingDrawing" xmlns:wp="http://schemas.openxmlformats.org/drawingml/2006/wordprocessingDrawing" xmlns:wpc="http://schemas.microsoft.com/office/word/2010/wordprocessingCanvas" xmlns:wpg="http://schemas.microsoft.com/office/word/2010/wordprocessingGroup" xmlns:wpi="http://schemas.microsoft.com/office/word/2010/wordprocessingInk" xmlns:wps="http://schemas.microsoft.com/office/word/2010/wordprocessingShape" mc:Ignorable="w14 wp14">
+  <w:p>
+    <w:pPr>
+      <w:pStyle w:val="Footer"/>
+      <w:jc w:val="center"/>
+    </w:pPr>
+    <w:r>
+      <w:rPr>
+        <w:color w:val="596678"/>
+        <w:sz w:val="18"/>
+      </w:rPr>
+      <w:fldChar w:fldCharType="begin"/>
+    </w:r>
+    <w:r>
+      <w:rPr>
+        <w:color w:val="596678"/>
+        <w:sz w:val="18"/>
+      </w:rPr>
+      <w:instrText xml:space="preserve"> PAGE </w:instrText>
+    </w:r>
+    <w:r>
+      <w:rPr>
+        <w:color w:val="596678"/>
+        <w:sz w:val="18"/>
+      </w:rPr>
+      <w:fldChar w:fldCharType="end"/>
+    </w:r>
+  </w:p>
+</w:ftr>
 </file>
 
 <file path=word/numbering.xml><?xml version="1.0" encoding="utf-8"?>

</xml_diff>